<commit_message>
Dodanie gotowego raportu i checklisty w PDF, usuniecie szkicu raportu
- doc/raport.pdf - finalny raport (wczesniej byl tylko szkic raport_draft.md)
- doc/checklist.pdf - wypelniona checklista w wymaganym formacie PDF
- usuniety doc/raport_draft.md, zastapiony przez raport.pdf
</commit_message>
<xml_diff>
--- a/doc/checklist.docx
+++ b/doc/checklist.docx
@@ -62,7 +62,7 @@
         <w:ind w:right="0" w:left="0" w:firstLine="0"/>
         <w:jc w:val="left"/>
         <w:rPr>
-          <w:rFonts w:ascii="Liberation Sans" w:hAnsi="Liberation Sans" w:cs="Liberation Sans" w:eastAsia="Liberation Sans"/>
+          <w:rFonts w:ascii="Calibri" w:hAnsi="Calibri" w:cs="Calibri" w:eastAsia="Calibri"/>
           <w:b/>
           <w:color w:val="auto"/>
           <w:spacing w:val="0"/>
@@ -190,7 +190,6 @@
                 <w:spacing w:val="0"/>
                 <w:position w:val="0"/>
                 <w:sz w:val="22"/>
-                <w:shd w:fill="auto" w:val="clear"/>
               </w:rPr>
             </w:pPr>
             <w:r>
@@ -236,7 +235,6 @@
                 <w:spacing w:val="0"/>
                 <w:position w:val="0"/>
                 <w:sz w:val="22"/>
-                <w:shd w:fill="auto" w:val="clear"/>
               </w:rPr>
             </w:pPr>
             <w:r>
@@ -295,7 +293,6 @@
                 <w:spacing w:val="0"/>
                 <w:position w:val="0"/>
                 <w:sz w:val="22"/>
-                <w:shd w:fill="auto" w:val="clear"/>
               </w:rPr>
             </w:pPr>
             <w:r>
@@ -360,7 +357,6 @@
                 <w:spacing w:val="0"/>
                 <w:position w:val="0"/>
                 <w:sz w:val="22"/>
-                <w:shd w:fill="auto" w:val="clear"/>
               </w:rPr>
             </w:pPr>
             <w:r>
@@ -383,7 +379,29 @@
                 <w:sz w:val="22"/>
                 <w:shd w:fill="auto" w:val="clear"/>
               </w:rPr>
-              <w:t xml:space="preserve">ł załączony w formacie PDF? ( TAK / NIE )</w:t>
+              <w:t xml:space="preserve">ł</w:t>
+            </w:r>
+            <w:r>
+              <w:rPr>
+                <w:rFonts w:ascii="Calibri" w:hAnsi="Calibri" w:cs="Calibri" w:eastAsia="Calibri"/>
+                <w:color w:val="auto"/>
+                <w:spacing w:val="0"/>
+                <w:position w:val="0"/>
+                <w:sz w:val="22"/>
+                <w:shd w:fill="auto" w:val="clear"/>
+              </w:rPr>
+              <w:t xml:space="preserve"> za</w:t>
+            </w:r>
+            <w:r>
+              <w:rPr>
+                <w:rFonts w:ascii="Calibri" w:hAnsi="Calibri" w:cs="Calibri" w:eastAsia="Calibri"/>
+                <w:color w:val="auto"/>
+                <w:spacing w:val="0"/>
+                <w:position w:val="0"/>
+                <w:sz w:val="22"/>
+                <w:shd w:fill="auto" w:val="clear"/>
+              </w:rPr>
+              <w:t xml:space="preserve">łączony w formacie PDF? ( TAK / NIE )</w:t>
             </w:r>
           </w:p>
         </w:tc>
@@ -415,7 +433,6 @@
                 <w:spacing w:val="0"/>
                 <w:position w:val="0"/>
                 <w:sz w:val="22"/>
-                <w:shd w:fill="auto" w:val="clear"/>
               </w:rPr>
             </w:pPr>
             <w:r>
@@ -460,19 +477,18 @@
                 <w:spacing w:val="0"/>
                 <w:position w:val="0"/>
                 <w:sz w:val="22"/>
-                <w:shd w:fill="auto" w:val="clear"/>
-              </w:rPr>
-            </w:pPr>
-            <w:r>
-              <w:rPr>
-                <w:rFonts w:ascii="Calibri" w:hAnsi="Calibri" w:cs="Calibri" w:eastAsia="Calibri"/>
-                <w:color w:val="auto"/>
-                <w:spacing w:val="0"/>
-                <w:position w:val="0"/>
-                <w:sz w:val="22"/>
-                <w:shd w:fill="auto" w:val="clear"/>
-              </w:rPr>
-              <w:t xml:space="preserve">NIE</w:t>
+              </w:rPr>
+            </w:pPr>
+            <w:r>
+              <w:rPr>
+                <w:rFonts w:ascii="Calibri" w:hAnsi="Calibri" w:cs="Calibri" w:eastAsia="Calibri"/>
+                <w:color w:val="auto"/>
+                <w:spacing w:val="0"/>
+                <w:position w:val="0"/>
+                <w:sz w:val="22"/>
+                <w:shd w:fill="auto" w:val="clear"/>
+              </w:rPr>
+              <w:t xml:space="preserve">TAK</w:t>
             </w:r>
           </w:p>
         </w:tc>
@@ -510,7 +526,6 @@
                 <w:spacing w:val="0"/>
                 <w:position w:val="0"/>
                 <w:sz w:val="22"/>
-                <w:shd w:fill="auto" w:val="clear"/>
               </w:rPr>
             </w:pPr>
             <w:r>
@@ -556,8 +571,40 @@
                 <w:sz w:val="22"/>
                 <w:shd w:fill="auto" w:val="clear"/>
               </w:rPr>
-              <w:t xml:space="preserve">ł</w:t>
-            </w:r>
+              <w:t xml:space="preserve">ł umieszczony bitstream? ( TAK / NIE )</w:t>
+            </w:r>
+          </w:p>
+        </w:tc>
+        <w:tc>
+          <w:tcPr>
+            <w:tcW w:w="1494" w:type="dxa"/>
+            <w:tcBorders>
+              <w:top w:val="single" w:color="000000" w:sz="0"/>
+              <w:left w:val="single" w:color="000000" w:sz="2"/>
+              <w:bottom w:val="single" w:color="000000" w:sz="2"/>
+              <w:right w:val="single" w:color="000000" w:sz="0"/>
+            </w:tcBorders>
+            <w:shd w:color="000000" w:fill="ffffff" w:val="clear"/>
+            <w:tcMar>
+              <w:left w:w="54" w:type="dxa"/>
+              <w:right w:w="54" w:type="dxa"/>
+            </w:tcMar>
+            <w:vAlign w:val="top"/>
+          </w:tcPr>
+          <w:p>
+            <w:pPr>
+              <w:suppressLineNumbers w:val="true"/>
+              <w:suppressAutoHyphens w:val="true"/>
+              <w:spacing w:before="0" w:after="0" w:line="240"/>
+              <w:ind w:right="0" w:left="0" w:firstLine="0"/>
+              <w:jc w:val="center"/>
+              <w:rPr>
+                <w:color w:val="auto"/>
+                <w:spacing w:val="0"/>
+                <w:position w:val="0"/>
+                <w:sz w:val="22"/>
+              </w:rPr>
+            </w:pPr>
             <w:r>
               <w:rPr>
                 <w:rFonts w:ascii="Liberation Serif" w:hAnsi="Liberation Serif" w:cs="Liberation Serif" w:eastAsia="Liberation Serif"/>
@@ -567,18 +614,18 @@
                 <w:sz w:val="22"/>
                 <w:shd w:fill="auto" w:val="clear"/>
               </w:rPr>
-              <w:t xml:space="preserve"> umieszczony bitstream? ( TAK / NIE )</w:t>
-            </w:r>
-          </w:p>
-        </w:tc>
-        <w:tc>
-          <w:tcPr>
-            <w:tcW w:w="1494" w:type="dxa"/>
-            <w:tcBorders>
-              <w:top w:val="single" w:color="000000" w:sz="0"/>
-              <w:left w:val="single" w:color="000000" w:sz="2"/>
-              <w:bottom w:val="single" w:color="000000" w:sz="2"/>
-              <w:right w:val="single" w:color="000000" w:sz="0"/>
+              <w:t xml:space="preserve">TAK</w:t>
+            </w:r>
+          </w:p>
+        </w:tc>
+        <w:tc>
+          <w:tcPr>
+            <w:tcW w:w="1495" w:type="dxa"/>
+            <w:tcBorders>
+              <w:top w:val="single" w:color="000000" w:sz="0"/>
+              <w:left w:val="single" w:color="000000" w:sz="2"/>
+              <w:bottom w:val="single" w:color="000000" w:sz="2"/>
+              <w:right w:val="single" w:color="000000" w:sz="2"/>
             </w:tcBorders>
             <w:shd w:color="000000" w:fill="ffffff" w:val="clear"/>
             <w:tcMar>
@@ -595,56 +642,11 @@
               <w:ind w:right="0" w:left="0" w:firstLine="0"/>
               <w:jc w:val="center"/>
               <w:rPr>
-                <w:color w:val="auto"/>
-                <w:spacing w:val="0"/>
-                <w:position w:val="0"/>
-                <w:sz w:val="22"/>
-                <w:shd w:fill="auto" w:val="clear"/>
-              </w:rPr>
-            </w:pPr>
-            <w:r>
-              <w:rPr>
-                <w:rFonts w:ascii="Liberation Serif" w:hAnsi="Liberation Serif" w:cs="Liberation Serif" w:eastAsia="Liberation Serif"/>
-                <w:color w:val="auto"/>
-                <w:spacing w:val="0"/>
-                <w:position w:val="0"/>
-                <w:sz w:val="22"/>
-                <w:shd w:fill="auto" w:val="clear"/>
-              </w:rPr>
-              <w:t xml:space="preserve">TAK</w:t>
-            </w:r>
-          </w:p>
-        </w:tc>
-        <w:tc>
-          <w:tcPr>
-            <w:tcW w:w="1495" w:type="dxa"/>
-            <w:tcBorders>
-              <w:top w:val="single" w:color="000000" w:sz="0"/>
-              <w:left w:val="single" w:color="000000" w:sz="2"/>
-              <w:bottom w:val="single" w:color="000000" w:sz="2"/>
-              <w:right w:val="single" w:color="000000" w:sz="2"/>
-            </w:tcBorders>
-            <w:shd w:color="000000" w:fill="ffffff" w:val="clear"/>
-            <w:tcMar>
-              <w:left w:w="54" w:type="dxa"/>
-              <w:right w:w="54" w:type="dxa"/>
-            </w:tcMar>
-            <w:vAlign w:val="top"/>
-          </w:tcPr>
-          <w:p>
-            <w:pPr>
-              <w:suppressLineNumbers w:val="true"/>
-              <w:suppressAutoHyphens w:val="true"/>
-              <w:spacing w:before="0" w:after="0" w:line="240"/>
-              <w:ind w:right="0" w:left="0" w:firstLine="0"/>
-              <w:jc w:val="center"/>
-              <w:rPr>
-                <w:rFonts w:ascii="Calibri" w:hAnsi="Calibri" w:cs="Calibri" w:eastAsia="Calibri"/>
-                <w:color w:val="auto"/>
-                <w:spacing w:val="0"/>
-                <w:position w:val="0"/>
-                <w:sz w:val="22"/>
-                <w:shd w:fill="auto" w:val="clear"/>
+                <w:rFonts w:ascii="Calibri" w:hAnsi="Calibri" w:cs="Calibri" w:eastAsia="Calibri"/>
+                <w:color w:val="auto"/>
+                <w:spacing w:val="0"/>
+                <w:position w:val="0"/>
+                <w:sz w:val="22"/>
               </w:rPr>
             </w:pPr>
             <w:r>
@@ -694,7 +696,6 @@
                 <w:spacing w:val="0"/>
                 <w:position w:val="0"/>
                 <w:sz w:val="22"/>
-                <w:shd w:fill="auto" w:val="clear"/>
               </w:rPr>
             </w:pPr>
             <w:r>
@@ -717,7 +718,18 @@
                 <w:sz w:val="22"/>
                 <w:shd w:fill="auto" w:val="clear"/>
               </w:rPr>
-              <w:t xml:space="preserve">ą? ( TAK / NIE )</w:t>
+              <w:t xml:space="preserve">ą</w:t>
+            </w:r>
+            <w:r>
+              <w:rPr>
+                <w:rFonts w:ascii="Calibri" w:hAnsi="Calibri" w:cs="Calibri" w:eastAsia="Calibri"/>
+                <w:color w:val="auto"/>
+                <w:spacing w:val="0"/>
+                <w:position w:val="0"/>
+                <w:sz w:val="22"/>
+                <w:shd w:fill="auto" w:val="clear"/>
+              </w:rPr>
+              <w:t xml:space="preserve">? ( TAK / NIE )</w:t>
             </w:r>
           </w:p>
         </w:tc>
@@ -749,7 +761,6 @@
                 <w:spacing w:val="0"/>
                 <w:position w:val="0"/>
                 <w:sz w:val="22"/>
-                <w:shd w:fill="auto" w:val="clear"/>
               </w:rPr>
             </w:pPr>
             <w:r>
@@ -794,19 +805,18 @@
                 <w:spacing w:val="0"/>
                 <w:position w:val="0"/>
                 <w:sz w:val="22"/>
-                <w:shd w:fill="auto" w:val="clear"/>
-              </w:rPr>
-            </w:pPr>
-            <w:r>
-              <w:rPr>
-                <w:rFonts w:ascii="Calibri" w:hAnsi="Calibri" w:cs="Calibri" w:eastAsia="Calibri"/>
-                <w:color w:val="auto"/>
-                <w:spacing w:val="0"/>
-                <w:position w:val="0"/>
-                <w:sz w:val="22"/>
-                <w:shd w:fill="auto" w:val="clear"/>
-              </w:rPr>
-              <w:t xml:space="preserve">NIE</w:t>
+              </w:rPr>
+            </w:pPr>
+            <w:r>
+              <w:rPr>
+                <w:rFonts w:ascii="Calibri" w:hAnsi="Calibri" w:cs="Calibri" w:eastAsia="Calibri"/>
+                <w:color w:val="auto"/>
+                <w:spacing w:val="0"/>
+                <w:position w:val="0"/>
+                <w:sz w:val="22"/>
+                <w:shd w:fill="auto" w:val="clear"/>
+              </w:rPr>
+              <w:t xml:space="preserve">TAK</w:t>
             </w:r>
           </w:p>
         </w:tc>
@@ -844,7 +854,6 @@
                 <w:spacing w:val="0"/>
                 <w:position w:val="0"/>
                 <w:sz w:val="22"/>
-                <w:shd w:fill="auto" w:val="clear"/>
               </w:rPr>
             </w:pPr>
             <w:r>
@@ -867,7 +876,29 @@
                 <w:sz w:val="22"/>
                 <w:shd w:fill="auto" w:val="clear"/>
               </w:rPr>
-              <w:t xml:space="preserve">ła poprawność załadowanego repozytorium projektu poprzez sklonowanie go w nowym katalogu, uruchomienie symulacji i wygenerowanie bitstream'u? ( TAK / NIE )</w:t>
+              <w:t xml:space="preserve">ł</w:t>
+            </w:r>
+            <w:r>
+              <w:rPr>
+                <w:rFonts w:ascii="Calibri" w:hAnsi="Calibri" w:cs="Calibri" w:eastAsia="Calibri"/>
+                <w:color w:val="auto"/>
+                <w:spacing w:val="0"/>
+                <w:position w:val="0"/>
+                <w:sz w:val="22"/>
+                <w:shd w:fill="auto" w:val="clear"/>
+              </w:rPr>
+              <w:t xml:space="preserve">a poprawno</w:t>
+            </w:r>
+            <w:r>
+              <w:rPr>
+                <w:rFonts w:ascii="Calibri" w:hAnsi="Calibri" w:cs="Calibri" w:eastAsia="Calibri"/>
+                <w:color w:val="auto"/>
+                <w:spacing w:val="0"/>
+                <w:position w:val="0"/>
+                <w:sz w:val="22"/>
+                <w:shd w:fill="auto" w:val="clear"/>
+              </w:rPr>
+              <w:t xml:space="preserve">ść załadowanego repozytorium projektu poprzez sklonowanie go w nowym katalogu, uruchomienie symulacji i wygenerowanie bitstream'u? ( TAK / NIE )</w:t>
             </w:r>
           </w:p>
         </w:tc>
@@ -899,7 +930,6 @@
                 <w:spacing w:val="0"/>
                 <w:position w:val="0"/>
                 <w:sz w:val="22"/>
-                <w:shd w:fill="auto" w:val="clear"/>
               </w:rPr>
             </w:pPr>
             <w:r>
@@ -944,19 +974,18 @@
                 <w:spacing w:val="0"/>
                 <w:position w:val="0"/>
                 <w:sz w:val="22"/>
-                <w:shd w:fill="auto" w:val="clear"/>
-              </w:rPr>
-            </w:pPr>
-            <w:r>
-              <w:rPr>
-                <w:rFonts w:ascii="Calibri" w:hAnsi="Calibri" w:cs="Calibri" w:eastAsia="Calibri"/>
-                <w:color w:val="auto"/>
-                <w:spacing w:val="0"/>
-                <w:position w:val="0"/>
-                <w:sz w:val="22"/>
-                <w:shd w:fill="auto" w:val="clear"/>
-              </w:rPr>
-              <w:t xml:space="preserve">NIE</w:t>
+              </w:rPr>
+            </w:pPr>
+            <w:r>
+              <w:rPr>
+                <w:rFonts w:ascii="Calibri" w:hAnsi="Calibri" w:cs="Calibri" w:eastAsia="Calibri"/>
+                <w:color w:val="auto"/>
+                <w:spacing w:val="0"/>
+                <w:position w:val="0"/>
+                <w:sz w:val="22"/>
+                <w:shd w:fill="auto" w:val="clear"/>
+              </w:rPr>
+              <w:t xml:space="preserve">TAK</w:t>
             </w:r>
           </w:p>
         </w:tc>
@@ -994,7 +1023,6 @@
                 <w:spacing w:val="0"/>
                 <w:position w:val="0"/>
                 <w:sz w:val="22"/>
-                <w:shd w:fill="auto" w:val="clear"/>
               </w:rPr>
             </w:pPr>
             <w:r>
@@ -1017,7 +1045,18 @@
                 <w:sz w:val="22"/>
                 <w:shd w:fill="auto" w:val="clear"/>
               </w:rPr>
-              <w:t xml:space="preserve">żytej wersji Vivado</w:t>
+              <w:t xml:space="preserve">ż</w:t>
+            </w:r>
+            <w:r>
+              <w:rPr>
+                <w:rFonts w:ascii="Calibri" w:hAnsi="Calibri" w:cs="Calibri" w:eastAsia="Calibri"/>
+                <w:color w:val="auto"/>
+                <w:spacing w:val="0"/>
+                <w:position w:val="0"/>
+                <w:sz w:val="22"/>
+                <w:shd w:fill="auto" w:val="clear"/>
+              </w:rPr>
+              <w:t xml:space="preserve">ytej wersji Vivado</w:t>
             </w:r>
           </w:p>
         </w:tc>
@@ -1084,7 +1123,6 @@
                 <w:spacing w:val="0"/>
                 <w:position w:val="0"/>
                 <w:sz w:val="22"/>
-                <w:shd w:fill="auto" w:val="clear"/>
               </w:rPr>
             </w:pPr>
             <w:r>
@@ -1134,7 +1172,6 @@
                 <w:spacing w:val="0"/>
                 <w:position w:val="0"/>
                 <w:sz w:val="22"/>
-                <w:shd w:fill="auto" w:val="clear"/>
               </w:rPr>
             </w:pPr>
             <w:r>
@@ -1157,7 +1194,18 @@
                 <w:sz w:val="22"/>
                 <w:shd w:fill="auto" w:val="clear"/>
               </w:rPr>
-              <w:t xml:space="preserve">łęd</w:t>
+              <w:t xml:space="preserve">łę</w:t>
+            </w:r>
+            <w:r>
+              <w:rPr>
+                <w:rFonts w:ascii="Calibri" w:hAnsi="Calibri" w:cs="Calibri" w:eastAsia="Calibri"/>
+                <w:color w:val="auto"/>
+                <w:spacing w:val="0"/>
+                <w:position w:val="0"/>
+                <w:sz w:val="22"/>
+                <w:shd w:fill="auto" w:val="clear"/>
+              </w:rPr>
+              <w:t xml:space="preserve">d</w:t>
             </w:r>
             <w:r>
               <w:rPr>
@@ -1179,7 +1227,18 @@
                 <w:sz w:val="22"/>
                 <w:shd w:fill="auto" w:val="clear"/>
               </w:rPr>
-              <w:t xml:space="preserve">łoszonych przez Vivado</w:t>
+              <w:t xml:space="preserve">ł</w:t>
+            </w:r>
+            <w:r>
+              <w:rPr>
+                <w:rFonts w:ascii="Calibri" w:hAnsi="Calibri" w:cs="Calibri" w:eastAsia="Calibri"/>
+                <w:color w:val="auto"/>
+                <w:spacing w:val="0"/>
+                <w:position w:val="0"/>
+                <w:sz w:val="22"/>
+                <w:shd w:fill="auto" w:val="clear"/>
+              </w:rPr>
+              <w:t xml:space="preserve">oszonych przez Vivado</w:t>
             </w:r>
           </w:p>
         </w:tc>
@@ -1211,7 +1270,6 @@
                 <w:spacing w:val="0"/>
                 <w:position w:val="0"/>
                 <w:sz w:val="22"/>
-                <w:shd w:fill="auto" w:val="clear"/>
               </w:rPr>
             </w:pPr>
             <w:r>
@@ -1256,7 +1314,6 @@
                 <w:spacing w:val="0"/>
                 <w:position w:val="0"/>
                 <w:sz w:val="22"/>
-                <w:shd w:fill="auto" w:val="clear"/>
               </w:rPr>
             </w:pPr>
             <w:r>
@@ -1306,7 +1363,6 @@
                 <w:spacing w:val="0"/>
                 <w:position w:val="0"/>
                 <w:sz w:val="22"/>
-                <w:shd w:fill="auto" w:val="clear"/>
               </w:rPr>
             </w:pPr>
             <w:r>
@@ -1329,7 +1385,29 @@
                 <w:sz w:val="22"/>
                 <w:shd w:fill="auto" w:val="clear"/>
               </w:rPr>
-              <w:t xml:space="preserve">żeń krytycznych (</w:t>
+              <w:t xml:space="preserve">ż</w:t>
+            </w:r>
+            <w:r>
+              <w:rPr>
+                <w:rFonts w:ascii="Calibri" w:hAnsi="Calibri" w:cs="Calibri" w:eastAsia="Calibri"/>
+                <w:color w:val="auto"/>
+                <w:spacing w:val="0"/>
+                <w:position w:val="0"/>
+                <w:sz w:val="22"/>
+                <w:shd w:fill="auto" w:val="clear"/>
+              </w:rPr>
+              <w:t xml:space="preserve">e</w:t>
+            </w:r>
+            <w:r>
+              <w:rPr>
+                <w:rFonts w:ascii="Calibri" w:hAnsi="Calibri" w:cs="Calibri" w:eastAsia="Calibri"/>
+                <w:color w:val="auto"/>
+                <w:spacing w:val="0"/>
+                <w:position w:val="0"/>
+                <w:sz w:val="22"/>
+                <w:shd w:fill="auto" w:val="clear"/>
+              </w:rPr>
+              <w:t xml:space="preserve">ń krytycznych (</w:t>
             </w:r>
             <w:r>
               <w:rPr>
@@ -1384,7 +1462,6 @@
                 <w:spacing w:val="0"/>
                 <w:position w:val="0"/>
                 <w:sz w:val="22"/>
-                <w:shd w:fill="auto" w:val="clear"/>
               </w:rPr>
             </w:pPr>
             <w:r>
@@ -1429,7 +1506,6 @@
                 <w:spacing w:val="0"/>
                 <w:position w:val="0"/>
                 <w:sz w:val="22"/>
-                <w:shd w:fill="auto" w:val="clear"/>
               </w:rPr>
             </w:pPr>
             <w:r>
@@ -1479,7 +1555,6 @@
                 <w:spacing w:val="0"/>
                 <w:position w:val="0"/>
                 <w:sz w:val="22"/>
-                <w:shd w:fill="auto" w:val="clear"/>
               </w:rPr>
             </w:pPr>
             <w:r>
@@ -1502,7 +1577,29 @@
                 <w:sz w:val="22"/>
                 <w:shd w:fill="auto" w:val="clear"/>
               </w:rPr>
-              <w:t xml:space="preserve">żeń zwykłych (</w:t>
+              <w:t xml:space="preserve">ż</w:t>
+            </w:r>
+            <w:r>
+              <w:rPr>
+                <w:rFonts w:ascii="Calibri" w:hAnsi="Calibri" w:cs="Calibri" w:eastAsia="Calibri"/>
+                <w:color w:val="auto"/>
+                <w:spacing w:val="0"/>
+                <w:position w:val="0"/>
+                <w:sz w:val="22"/>
+                <w:shd w:fill="auto" w:val="clear"/>
+              </w:rPr>
+              <w:t xml:space="preserve">e</w:t>
+            </w:r>
+            <w:r>
+              <w:rPr>
+                <w:rFonts w:ascii="Calibri" w:hAnsi="Calibri" w:cs="Calibri" w:eastAsia="Calibri"/>
+                <w:color w:val="auto"/>
+                <w:spacing w:val="0"/>
+                <w:position w:val="0"/>
+                <w:sz w:val="22"/>
+                <w:shd w:fill="auto" w:val="clear"/>
+              </w:rPr>
+              <w:t xml:space="preserve">ń zwykłych (</w:t>
             </w:r>
             <w:r>
               <w:rPr>
@@ -1592,19 +1689,40 @@
                 <w:spacing w:val="0"/>
                 <w:position w:val="0"/>
                 <w:sz w:val="22"/>
-                <w:shd w:fill="auto" w:val="clear"/>
-              </w:rPr>
-            </w:pPr>
-            <w:r>
-              <w:rPr>
-                <w:rFonts w:ascii="Calibri" w:hAnsi="Calibri" w:cs="Calibri" w:eastAsia="Calibri"/>
-                <w:color w:val="auto"/>
-                <w:spacing w:val="0"/>
-                <w:position w:val="0"/>
-                <w:sz w:val="22"/>
-                <w:shd w:fill="auto" w:val="clear"/>
-              </w:rPr>
-              <w:t xml:space="preserve">133 </w:t>
+              </w:rPr>
+            </w:pPr>
+            <w:r>
+              <w:rPr>
+                <w:rFonts w:ascii="Calibri" w:hAnsi="Calibri" w:cs="Calibri" w:eastAsia="Calibri"/>
+                <w:color w:val="auto"/>
+                <w:spacing w:val="0"/>
+                <w:position w:val="0"/>
+                <w:sz w:val="22"/>
+                <w:shd w:fill="auto" w:val="clear"/>
+              </w:rPr>
+              <w:t xml:space="preserve">13</w:t>
+            </w:r>
+            <w:r>
+              <w:rPr>
+                <w:rFonts w:ascii="Calibri" w:hAnsi="Calibri" w:cs="Calibri" w:eastAsia="Calibri"/>
+                <w:color w:val="auto"/>
+                <w:spacing w:val="0"/>
+                <w:position w:val="0"/>
+                <w:sz w:val="22"/>
+                <w:shd w:fill="auto" w:val="clear"/>
+              </w:rPr>
+              <w:t xml:space="preserve">5</w:t>
+            </w:r>
+            <w:r>
+              <w:rPr>
+                <w:rFonts w:ascii="Calibri" w:hAnsi="Calibri" w:cs="Calibri" w:eastAsia="Calibri"/>
+                <w:color w:val="auto"/>
+                <w:spacing w:val="0"/>
+                <w:position w:val="0"/>
+                <w:sz w:val="22"/>
+                <w:shd w:fill="auto" w:val="clear"/>
+              </w:rPr>
+              <w:t xml:space="preserve"> </w:t>
             </w:r>
           </w:p>
         </w:tc>
@@ -1642,7 +1760,6 @@
                 <w:spacing w:val="0"/>
                 <w:position w:val="0"/>
                 <w:sz w:val="22"/>
-                <w:shd w:fill="auto" w:val="clear"/>
               </w:rPr>
             </w:pPr>
             <w:r>
@@ -1665,7 +1782,18 @@
                 <w:sz w:val="22"/>
                 <w:shd w:fill="auto" w:val="clear"/>
               </w:rPr>
-              <w:t xml:space="preserve">żytkownika ( klawiatura / mysz / ... )</w:t>
+              <w:t xml:space="preserve">ż</w:t>
+            </w:r>
+            <w:r>
+              <w:rPr>
+                <w:rFonts w:ascii="Calibri" w:hAnsi="Calibri" w:cs="Calibri" w:eastAsia="Calibri"/>
+                <w:color w:val="auto"/>
+                <w:spacing w:val="0"/>
+                <w:position w:val="0"/>
+                <w:sz w:val="22"/>
+                <w:shd w:fill="auto" w:val="clear"/>
+              </w:rPr>
+              <w:t xml:space="preserve">ytkownika ( klawiatura / mysz / ... )</w:t>
             </w:r>
           </w:p>
         </w:tc>
@@ -1732,7 +1860,6 @@
                 <w:spacing w:val="0"/>
                 <w:position w:val="0"/>
                 <w:sz w:val="22"/>
-                <w:shd w:fill="auto" w:val="clear"/>
               </w:rPr>
             </w:pPr>
             <w:r>
@@ -1793,7 +1920,6 @@
                 <w:spacing w:val="0"/>
                 <w:position w:val="0"/>
                 <w:sz w:val="22"/>
-                <w:shd w:fill="auto" w:val="clear"/>
               </w:rPr>
             </w:pPr>
             <w:r>
@@ -1816,7 +1942,29 @@
                 <w:sz w:val="22"/>
                 <w:shd w:fill="auto" w:val="clear"/>
               </w:rPr>
-              <w:t xml:space="preserve">życie ekranu jako wyjścia ( TAK / NIE )</w:t>
+              <w:t xml:space="preserve">ż</w:t>
+            </w:r>
+            <w:r>
+              <w:rPr>
+                <w:rFonts w:ascii="Calibri" w:hAnsi="Calibri" w:cs="Calibri" w:eastAsia="Calibri"/>
+                <w:color w:val="auto"/>
+                <w:spacing w:val="0"/>
+                <w:position w:val="0"/>
+                <w:sz w:val="22"/>
+                <w:shd w:fill="auto" w:val="clear"/>
+              </w:rPr>
+              <w:t xml:space="preserve">ycie ekranu jako wyj</w:t>
+            </w:r>
+            <w:r>
+              <w:rPr>
+                <w:rFonts w:ascii="Calibri" w:hAnsi="Calibri" w:cs="Calibri" w:eastAsia="Calibri"/>
+                <w:color w:val="auto"/>
+                <w:spacing w:val="0"/>
+                <w:position w:val="0"/>
+                <w:sz w:val="22"/>
+                <w:shd w:fill="auto" w:val="clear"/>
+              </w:rPr>
+              <w:t xml:space="preserve">ścia ( TAK / NIE )</w:t>
             </w:r>
           </w:p>
         </w:tc>
@@ -1848,7 +1996,6 @@
                 <w:spacing w:val="0"/>
                 <w:position w:val="0"/>
                 <w:sz w:val="22"/>
-                <w:shd w:fill="auto" w:val="clear"/>
               </w:rPr>
             </w:pPr>
             <w:r>
@@ -1893,7 +2040,6 @@
                 <w:spacing w:val="0"/>
                 <w:position w:val="0"/>
                 <w:sz w:val="22"/>
-                <w:shd w:fill="auto" w:val="clear"/>
               </w:rPr>
             </w:pPr>
             <w:r>
@@ -1943,7 +2089,6 @@
                 <w:spacing w:val="0"/>
                 <w:position w:val="0"/>
                 <w:sz w:val="22"/>
-                <w:shd w:fill="auto" w:val="clear"/>
               </w:rPr>
             </w:pPr>
             <w:r>
@@ -1966,7 +2111,18 @@
                 <w:sz w:val="22"/>
                 <w:shd w:fill="auto" w:val="clear"/>
               </w:rPr>
-              <w:t xml:space="preserve">ść ekranu ( X px / Y px )</w:t>
+              <w:t xml:space="preserve">ść</w:t>
+            </w:r>
+            <w:r>
+              <w:rPr>
+                <w:rFonts w:ascii="Calibri" w:hAnsi="Calibri" w:cs="Calibri" w:eastAsia="Calibri"/>
+                <w:color w:val="auto"/>
+                <w:spacing w:val="0"/>
+                <w:position w:val="0"/>
+                <w:sz w:val="22"/>
+                <w:shd w:fill="auto" w:val="clear"/>
+              </w:rPr>
+              <w:t xml:space="preserve"> ekranu ( X px / Y px )</w:t>
             </w:r>
           </w:p>
         </w:tc>
@@ -2033,7 +2189,6 @@
                 <w:spacing w:val="0"/>
                 <w:position w:val="0"/>
                 <w:sz w:val="22"/>
-                <w:shd w:fill="auto" w:val="clear"/>
               </w:rPr>
             </w:pPr>
             <w:r>
@@ -2083,7 +2238,6 @@
                 <w:spacing w:val="0"/>
                 <w:position w:val="0"/>
                 <w:sz w:val="22"/>
-                <w:shd w:fill="auto" w:val="clear"/>
               </w:rPr>
             </w:pPr>
             <w:r>
@@ -2106,7 +2260,29 @@
                 <w:sz w:val="22"/>
                 <w:shd w:fill="auto" w:val="clear"/>
               </w:rPr>
-              <w:t xml:space="preserve">ład używa resetu asynchronicznego? ( TAK / NIE )</w:t>
+              <w:t xml:space="preserve">ł</w:t>
+            </w:r>
+            <w:r>
+              <w:rPr>
+                <w:rFonts w:ascii="Calibri" w:hAnsi="Calibri" w:cs="Calibri" w:eastAsia="Calibri"/>
+                <w:color w:val="auto"/>
+                <w:spacing w:val="0"/>
+                <w:position w:val="0"/>
+                <w:sz w:val="22"/>
+                <w:shd w:fill="auto" w:val="clear"/>
+              </w:rPr>
+              <w:t xml:space="preserve">ad u</w:t>
+            </w:r>
+            <w:r>
+              <w:rPr>
+                <w:rFonts w:ascii="Calibri" w:hAnsi="Calibri" w:cs="Calibri" w:eastAsia="Calibri"/>
+                <w:color w:val="auto"/>
+                <w:spacing w:val="0"/>
+                <w:position w:val="0"/>
+                <w:sz w:val="22"/>
+                <w:shd w:fill="auto" w:val="clear"/>
+              </w:rPr>
+              <w:t xml:space="preserve">żywa resetu asynchronicznego? ( TAK / NIE )</w:t>
             </w:r>
           </w:p>
         </w:tc>
@@ -2138,7 +2314,6 @@
                 <w:spacing w:val="0"/>
                 <w:position w:val="0"/>
                 <w:sz w:val="22"/>
-                <w:shd w:fill="auto" w:val="clear"/>
               </w:rPr>
             </w:pPr>
             <w:r>
@@ -2183,7 +2358,6 @@
                 <w:spacing w:val="0"/>
                 <w:position w:val="0"/>
                 <w:sz w:val="22"/>
-                <w:shd w:fill="auto" w:val="clear"/>
               </w:rPr>
             </w:pPr>
             <w:r>
@@ -2233,7 +2407,6 @@
                 <w:spacing w:val="0"/>
                 <w:position w:val="0"/>
                 <w:sz w:val="22"/>
-                <w:shd w:fill="auto" w:val="clear"/>
               </w:rPr>
             </w:pPr>
             <w:r>
@@ -2256,7 +2429,29 @@
                 <w:sz w:val="22"/>
                 <w:shd w:fill="auto" w:val="clear"/>
               </w:rPr>
-              <w:t xml:space="preserve">łytce Basys3 użytego jako reset (BTND / BTNC /... )</w:t>
+              <w:t xml:space="preserve">ł</w:t>
+            </w:r>
+            <w:r>
+              <w:rPr>
+                <w:rFonts w:ascii="Calibri" w:hAnsi="Calibri" w:cs="Calibri" w:eastAsia="Calibri"/>
+                <w:color w:val="auto"/>
+                <w:spacing w:val="0"/>
+                <w:position w:val="0"/>
+                <w:sz w:val="22"/>
+                <w:shd w:fill="auto" w:val="clear"/>
+              </w:rPr>
+              <w:t xml:space="preserve">ytce Basys3 u</w:t>
+            </w:r>
+            <w:r>
+              <w:rPr>
+                <w:rFonts w:ascii="Calibri" w:hAnsi="Calibri" w:cs="Calibri" w:eastAsia="Calibri"/>
+                <w:color w:val="auto"/>
+                <w:spacing w:val="0"/>
+                <w:position w:val="0"/>
+                <w:sz w:val="22"/>
+                <w:shd w:fill="auto" w:val="clear"/>
+              </w:rPr>
+              <w:t xml:space="preserve">żytego jako reset (BTND / BTNC /... )</w:t>
             </w:r>
           </w:p>
         </w:tc>
@@ -2323,7 +2518,6 @@
                 <w:spacing w:val="0"/>
                 <w:position w:val="0"/>
                 <w:sz w:val="22"/>
-                <w:shd w:fill="auto" w:val="clear"/>
               </w:rPr>
             </w:pPr>
             <w:r>
@@ -2373,7 +2567,6 @@
                 <w:spacing w:val="0"/>
                 <w:position w:val="0"/>
                 <w:sz w:val="22"/>
-                <w:shd w:fill="auto" w:val="clear"/>
               </w:rPr>
             </w:pPr>
             <w:r>
@@ -2396,7 +2589,29 @@
                 <w:sz w:val="22"/>
                 <w:shd w:fill="auto" w:val="clear"/>
               </w:rPr>
-              <w:t xml:space="preserve">ły używają wyłącznie sygnał</w:t>
+              <w:t xml:space="preserve">ł</w:t>
+            </w:r>
+            <w:r>
+              <w:rPr>
+                <w:rFonts w:ascii="Calibri" w:hAnsi="Calibri" w:cs="Calibri" w:eastAsia="Calibri"/>
+                <w:color w:val="auto"/>
+                <w:spacing w:val="0"/>
+                <w:position w:val="0"/>
+                <w:sz w:val="22"/>
+                <w:shd w:fill="auto" w:val="clear"/>
+              </w:rPr>
+              <w:t xml:space="preserve">y u</w:t>
+            </w:r>
+            <w:r>
+              <w:rPr>
+                <w:rFonts w:ascii="Calibri" w:hAnsi="Calibri" w:cs="Calibri" w:eastAsia="Calibri"/>
+                <w:color w:val="auto"/>
+                <w:spacing w:val="0"/>
+                <w:position w:val="0"/>
+                <w:sz w:val="22"/>
+                <w:shd w:fill="auto" w:val="clear"/>
+              </w:rPr>
+              <w:t xml:space="preserve">żywają wyłącznie sygnał</w:t>
             </w:r>
             <w:r>
               <w:rPr>
@@ -2474,7 +2689,6 @@
                 <w:spacing w:val="0"/>
                 <w:position w:val="0"/>
                 <w:sz w:val="22"/>
-                <w:shd w:fill="auto" w:val="clear"/>
               </w:rPr>
             </w:pPr>
             <w:r>
@@ -2651,7 +2865,29 @@
           <w:sz w:val="24"/>
           <w:shd w:fill="auto" w:val="clear"/>
         </w:rPr>
-        <w:t xml:space="preserve">żeli twoje odpowiedzi są zgodne z odpowiedziami oczekiwanymi.</w:t>
+        <w:t xml:space="preserve">ż</w:t>
+      </w:r>
+      <w:r>
+        <w:rPr>
+          <w:rFonts w:ascii="Calibri" w:hAnsi="Calibri" w:cs="Calibri" w:eastAsia="Calibri"/>
+          <w:color w:val="auto"/>
+          <w:spacing w:val="0"/>
+          <w:position w:val="0"/>
+          <w:sz w:val="24"/>
+          <w:shd w:fill="auto" w:val="clear"/>
+        </w:rPr>
+        <w:t xml:space="preserve">eli twoje odpowiedzi s</w:t>
+      </w:r>
+      <w:r>
+        <w:rPr>
+          <w:rFonts w:ascii="Calibri" w:hAnsi="Calibri" w:cs="Calibri" w:eastAsia="Calibri"/>
+          <w:color w:val="auto"/>
+          <w:spacing w:val="0"/>
+          <w:position w:val="0"/>
+          <w:sz w:val="24"/>
+          <w:shd w:fill="auto" w:val="clear"/>
+        </w:rPr>
+        <w:t xml:space="preserve">ą zgodne z odpowiedziami oczekiwanymi.</w:t>
       </w:r>
     </w:p>
     <w:p>
@@ -2705,7 +2941,29 @@
           <w:sz w:val="24"/>
           <w:shd w:fill="auto" w:val="clear"/>
         </w:rPr>
-        <w:t xml:space="preserve">ąpienia nieuzasadnionych błęd</w:t>
+        <w:t xml:space="preserve">ą</w:t>
+      </w:r>
+      <w:r>
+        <w:rPr>
+          <w:rFonts w:ascii="Calibri" w:hAnsi="Calibri" w:cs="Calibri" w:eastAsia="Calibri"/>
+          <w:color w:val="auto"/>
+          <w:spacing w:val="0"/>
+          <w:position w:val="0"/>
+          <w:sz w:val="24"/>
+          <w:shd w:fill="auto" w:val="clear"/>
+        </w:rPr>
+        <w:t xml:space="preserve">pienia nieuzasadnionych b</w:t>
+      </w:r>
+      <w:r>
+        <w:rPr>
+          <w:rFonts w:ascii="Calibri" w:hAnsi="Calibri" w:cs="Calibri" w:eastAsia="Calibri"/>
+          <w:color w:val="auto"/>
+          <w:spacing w:val="0"/>
+          <w:position w:val="0"/>
+          <w:sz w:val="24"/>
+          <w:shd w:fill="auto" w:val="clear"/>
+        </w:rPr>
+        <w:t xml:space="preserve">łęd</w:t>
       </w:r>
       <w:r>
         <w:rPr>
@@ -2727,7 +2985,29 @@
           <w:sz w:val="24"/>
           <w:shd w:fill="auto" w:val="clear"/>
         </w:rPr>
-        <w:t xml:space="preserve">żeń krytycznych [oznaczonych (!)], oceną z projektu będzie 2.0 (ndst).</w:t>
+        <w:t xml:space="preserve">ż</w:t>
+      </w:r>
+      <w:r>
+        <w:rPr>
+          <w:rFonts w:ascii="Calibri" w:hAnsi="Calibri" w:cs="Calibri" w:eastAsia="Calibri"/>
+          <w:color w:val="auto"/>
+          <w:spacing w:val="0"/>
+          <w:position w:val="0"/>
+          <w:sz w:val="24"/>
+          <w:shd w:fill="auto" w:val="clear"/>
+        </w:rPr>
+        <w:t xml:space="preserve">e</w:t>
+      </w:r>
+      <w:r>
+        <w:rPr>
+          <w:rFonts w:ascii="Calibri" w:hAnsi="Calibri" w:cs="Calibri" w:eastAsia="Calibri"/>
+          <w:color w:val="auto"/>
+          <w:spacing w:val="0"/>
+          <w:position w:val="0"/>
+          <w:sz w:val="24"/>
+          <w:shd w:fill="auto" w:val="clear"/>
+        </w:rPr>
+        <w:t xml:space="preserve">ń krytycznych [oznaczonych (!)], oceną z projektu będzie 2.0 (ndst).</w:t>
       </w:r>
     </w:p>
   </w:body>

</xml_diff>